<commit_message>
Fleshing out state machine for all states and windows
</commit_message>
<xml_diff>
--- a/TheProspector/Assets/Docs/Related School Work/LUT/Questions and Ideas Pending.docx
+++ b/TheProspector/Assets/Docs/Related School Work/LUT/Questions and Ideas Pending.docx
@@ -182,7 +182,7 @@
           <w:lang w:val="en-GB"/>
         </w:rPr>
         <w:pict w14:anchorId="12424FF1">
-          <v:rect id="_x0000_i1073" style="width:0;height:1.5pt" o:hralign="center" o:hrstd="t" o:hr="t" fillcolor="#a0a0a0" stroked="f"/>
+          <v:rect id="_x0000_i1030" style="width:0;height:1.5pt" o:hralign="center" o:hrstd="t" o:hr="t" fillcolor="#a0a0a0" stroked="f"/>
         </w:pict>
       </w:r>
     </w:p>
@@ -462,7 +462,7 @@
         </w:rPr>
         <w:lastRenderedPageBreak/>
         <w:pict w14:anchorId="15017F89">
-          <v:rect id="_x0000_i1074" style="width:0;height:1.5pt" o:hralign="center" o:hrstd="t" o:hr="t" fillcolor="#a0a0a0" stroked="f"/>
+          <v:rect id="_x0000_i1031" style="width:0;height:1.5pt" o:hralign="center" o:hrstd="t" o:hr="t" fillcolor="#a0a0a0" stroked="f"/>
         </w:pict>
       </w:r>
     </w:p>
@@ -707,7 +707,7 @@
           <w:lang w:val="en-GB"/>
         </w:rPr>
         <w:pict w14:anchorId="758659F9">
-          <v:rect id="_x0000_i1075" style="width:0;height:1.5pt" o:hralign="center" o:hrstd="t" o:hr="t" fillcolor="#a0a0a0" stroked="f"/>
+          <v:rect id="_x0000_i1032" style="width:0;height:1.5pt" o:hralign="center" o:hrstd="t" o:hr="t" fillcolor="#a0a0a0" stroked="f"/>
         </w:pict>
       </w:r>
     </w:p>
@@ -775,19 +775,7 @@
         <w:rPr>
           <w:lang w:val="en-GB"/>
         </w:rPr>
-        <w:t xml:space="preserve"> UX / </w:t>
-      </w:r>
-      <w:r>
-        <w:rPr>
-          <w:lang w:val="en-GB"/>
-        </w:rPr>
-        <w:t>Flavour</w:t>
-      </w:r>
-      <w:r>
-        <w:rPr>
-          <w:lang w:val="en-GB"/>
-        </w:rPr>
-        <w:t xml:space="preserve"> Feature</w:t>
+        <w:t xml:space="preserve"> UX / Flavour Feature</w:t>
       </w:r>
     </w:p>
     <w:p>
@@ -813,21 +801,7 @@
           <w:lang w:val="en-GB"/>
         </w:rPr>
         <w:br/>
-        <w:t xml:space="preserve">Should the band’s country-of-origin suffix (e.g. </w:t>
-      </w:r>
-      <w:proofErr w:type="gramStart"/>
-      <w:r>
-        <w:rPr>
-          <w:lang w:val="en-GB"/>
-        </w:rPr>
-        <w:t>“.SNO</w:t>
-      </w:r>
-      <w:proofErr w:type="gramEnd"/>
-      <w:r>
-        <w:rPr>
-          <w:lang w:val="en-GB"/>
-        </w:rPr>
-        <w:t>”) be determined from the player’s real-world location instead of a dropdown?</w:t>
+        <w:t>Should the band’s country-of-origin suffix (e.g. “.SNO”) be determined from the player’s real-world location instead of a dropdown?</w:t>
       </w:r>
     </w:p>
     <w:p>
@@ -944,7 +918,7 @@
           <w:lang w:val="en-GB"/>
         </w:rPr>
         <w:pict w14:anchorId="3E368FEE">
-          <v:rect id="_x0000_i1076" style="width:0;height:1.5pt" o:hralign="center" o:hrstd="t" o:hr="t" fillcolor="#a0a0a0" stroked="f"/>
+          <v:rect id="_x0000_i1033" style="width:0;height:1.5pt" o:hralign="center" o:hrstd="t" o:hr="t" fillcolor="#a0a0a0" stroked="f"/>
         </w:pict>
       </w:r>
     </w:p>
@@ -1238,7 +1212,7 @@
           <w:lang w:val="en-GB"/>
         </w:rPr>
         <w:pict w14:anchorId="4E3C7BA5">
-          <v:rect id="_x0000_i1077" style="width:0;height:1.5pt" o:hralign="center" o:hrstd="t" o:hr="t" fillcolor="#a0a0a0" stroked="f"/>
+          <v:rect id="_x0000_i1034" style="width:0;height:1.5pt" o:hralign="center" o:hrstd="t" o:hr="t" fillcolor="#a0a0a0" stroked="f"/>
         </w:pict>
       </w:r>
     </w:p>
@@ -1501,7 +1475,7 @@
           <w:lang w:val="en-GB"/>
         </w:rPr>
         <w:pict w14:anchorId="01604F26">
-          <v:rect id="_x0000_i1078" style="width:0;height:1.5pt" o:hralign="center" o:hrstd="t" o:hr="t" fillcolor="#a0a0a0" stroked="f"/>
+          <v:rect id="_x0000_i1035" style="width:0;height:1.5pt" o:hralign="center" o:hrstd="t" o:hr="t" fillcolor="#a0a0a0" stroked="f"/>
         </w:pict>
       </w:r>
     </w:p>
@@ -1780,7 +1754,7 @@
           <w:lang w:val="en-GB"/>
         </w:rPr>
         <w:pict w14:anchorId="66C90EFD">
-          <v:rect id="_x0000_i1079" style="width:0;height:1.5pt" o:hralign="center" o:hrstd="t" o:hr="t" fillcolor="#a0a0a0" stroked="f"/>
+          <v:rect id="_x0000_i1036" style="width:0;height:1.5pt" o:hralign="center" o:hrstd="t" o:hr="t" fillcolor="#a0a0a0" stroked="f"/>
         </w:pict>
       </w:r>
     </w:p>
@@ -2043,7 +2017,7 @@
           <w:lang w:val="en-GB"/>
         </w:rPr>
         <w:pict w14:anchorId="4A50E3DE">
-          <v:rect id="_x0000_i1080" style="width:0;height:1.5pt" o:hralign="center" o:hrstd="t" o:hr="t" fillcolor="#a0a0a0" stroked="f"/>
+          <v:rect id="_x0000_i1037" style="width:0;height:1.5pt" o:hralign="center" o:hrstd="t" o:hr="t" fillcolor="#a0a0a0" stroked="f"/>
         </w:pict>
       </w:r>
     </w:p>
@@ -2196,7 +2170,7 @@
     <w:p>
       <w:pPr>
         <w:numPr>
-          <w:ilvl w:val="0"/>
+          <w:ilvl w:val="1"/>
           <w:numId w:val="9"/>
         </w:numPr>
         <w:rPr>
@@ -2205,6 +2179,23 @@
       </w:pPr>
       <w:r>
         <w:rPr>
+          <w:lang w:val="en-GB"/>
+        </w:rPr>
+        <w:t>There should be no detailed story beyond the background of the scene before turn 1. This background could be somewhat RNG/Procedural Gen, so “TRUE” could have different starting positions.</w:t>
+      </w:r>
+    </w:p>
+    <w:p>
+      <w:pPr>
+        <w:numPr>
+          <w:ilvl w:val="0"/>
+          <w:numId w:val="9"/>
+        </w:numPr>
+        <w:rPr>
+          <w:lang w:val="en-GB"/>
+        </w:rPr>
+      </w:pPr>
+      <w:r>
+        <w:rPr>
           <w:b/>
           <w:bCs/>
           <w:lang w:val="en-GB"/>
@@ -2245,7 +2236,1456 @@
     </w:p>
     <w:p>
       <w:pPr>
-        <w:rPr>
+        <w:pStyle w:val="Luettelokappale"/>
+        <w:rPr>
+          <w:lang w:val="en-GB"/>
+        </w:rPr>
+      </w:pPr>
+    </w:p>
+    <w:p>
+      <w:pPr>
+        <w:pStyle w:val="Luettelokappale"/>
+        <w:numPr>
+          <w:ilvl w:val="0"/>
+          <w:numId w:val="11"/>
+        </w:numPr>
+        <w:rPr>
+          <w:lang w:val="en-GB"/>
+        </w:rPr>
+      </w:pPr>
+    </w:p>
+    <w:p>
+      <w:pPr>
+        <w:rPr>
+          <w:b/>
+          <w:bCs/>
+          <w:lang w:val="en-GB"/>
+        </w:rPr>
+      </w:pPr>
+      <w:r>
+        <w:rPr>
+          <w:b/>
+          <w:bCs/>
+          <w:lang w:val="en-GB"/>
+        </w:rPr>
+        <w:t>QIP – 010 – Conceptualizing the main screen</w:t>
+      </w:r>
+    </w:p>
+    <w:p>
+      <w:pPr>
+        <w:pStyle w:val="Luettelokappale"/>
+        <w:numPr>
+          <w:ilvl w:val="0"/>
+          <w:numId w:val="10"/>
+        </w:numPr>
+        <w:rPr>
+          <w:b/>
+          <w:bCs/>
+          <w:lang w:val="en-GB"/>
+        </w:rPr>
+      </w:pPr>
+      <w:r>
+        <w:rPr>
+          <w:b/>
+          <w:bCs/>
+          <w:lang w:val="en-GB"/>
+        </w:rPr>
+        <w:t xml:space="preserve">Title: </w:t>
+      </w:r>
+      <w:r>
+        <w:rPr>
+          <w:lang w:val="en-GB"/>
+        </w:rPr>
+        <w:t xml:space="preserve">The main window while in play </w:t>
+      </w:r>
+      <w:r>
+        <w:rPr>
+          <w:lang w:val="en-GB"/>
+        </w:rPr>
+        <w:t>(accessible for all players)</w:t>
+      </w:r>
+    </w:p>
+    <w:p>
+      <w:pPr>
+        <w:pStyle w:val="Luettelokappale"/>
+        <w:numPr>
+          <w:ilvl w:val="0"/>
+          <w:numId w:val="10"/>
+        </w:numPr>
+        <w:rPr>
+          <w:b/>
+          <w:bCs/>
+          <w:lang w:val="en-GB"/>
+        </w:rPr>
+      </w:pPr>
+      <w:r>
+        <w:rPr>
+          <w:b/>
+          <w:bCs/>
+          <w:lang w:val="en-GB"/>
+        </w:rPr>
+        <w:t>Category:</w:t>
+      </w:r>
+      <w:r>
+        <w:rPr>
+          <w:lang w:val="en-GB"/>
+        </w:rPr>
+        <w:t xml:space="preserve"> UI &amp; Central Game Play Mechanics</w:t>
+      </w:r>
+    </w:p>
+    <w:p>
+      <w:pPr>
+        <w:pStyle w:val="Luettelokappale"/>
+        <w:numPr>
+          <w:ilvl w:val="0"/>
+          <w:numId w:val="10"/>
+        </w:numPr>
+        <w:rPr>
+          <w:b/>
+          <w:bCs/>
+          <w:lang w:val="en-GB"/>
+        </w:rPr>
+      </w:pPr>
+      <w:r>
+        <w:rPr>
+          <w:b/>
+          <w:bCs/>
+          <w:lang w:val="en-GB"/>
+        </w:rPr>
+        <w:t>Question / Idea:</w:t>
+      </w:r>
+      <w:r>
+        <w:rPr>
+          <w:lang w:val="en-GB"/>
+        </w:rPr>
+        <w:br/>
+        <w:t>What does the actual game screen look like at the beginning of the turn?</w:t>
+      </w:r>
+      <w:r>
+        <w:rPr>
+          <w:lang w:val="en-GB"/>
+        </w:rPr>
+        <w:t xml:space="preserve"> How does it serve The Keeper? The Player? The Outcast?</w:t>
+      </w:r>
+    </w:p>
+    <w:p>
+      <w:pPr>
+        <w:pStyle w:val="Luettelokappale"/>
+        <w:numPr>
+          <w:ilvl w:val="0"/>
+          <w:numId w:val="10"/>
+        </w:numPr>
+        <w:rPr>
+          <w:b/>
+          <w:bCs/>
+          <w:lang w:val="en-GB"/>
+        </w:rPr>
+      </w:pPr>
+      <w:r>
+        <w:rPr>
+          <w:b/>
+          <w:bCs/>
+          <w:lang w:val="en-GB"/>
+        </w:rPr>
+        <w:t>Current Thought:</w:t>
+      </w:r>
+    </w:p>
+    <w:p>
+      <w:pPr>
+        <w:pStyle w:val="Luettelokappale"/>
+        <w:numPr>
+          <w:ilvl w:val="1"/>
+          <w:numId w:val="10"/>
+        </w:numPr>
+        <w:rPr>
+          <w:b/>
+          <w:bCs/>
+          <w:lang w:val="en-GB"/>
+        </w:rPr>
+      </w:pPr>
+      <w:r>
+        <w:rPr>
+          <w:lang w:val="en-GB"/>
+        </w:rPr>
+        <w:t xml:space="preserve">The screen must depict a gaming board of some sort. The most important thing it does is establishing “TRUE” to the players – to show them what tags are in play and in what position. </w:t>
+      </w:r>
+    </w:p>
+    <w:p>
+      <w:pPr>
+        <w:pStyle w:val="Luettelokappale"/>
+        <w:numPr>
+          <w:ilvl w:val="1"/>
+          <w:numId w:val="10"/>
+        </w:numPr>
+        <w:rPr>
+          <w:b/>
+          <w:bCs/>
+          <w:lang w:val="en-GB"/>
+        </w:rPr>
+      </w:pPr>
+      <w:r>
+        <w:rPr>
+          <w:lang w:val="en-GB"/>
+        </w:rPr>
+        <w:lastRenderedPageBreak/>
+        <w:t>Only the Keeper can directly interact with the pieces on the board, within the confines of their Pull trait. The players should see in real time these interactions.</w:t>
+      </w:r>
+    </w:p>
+    <w:p>
+      <w:pPr>
+        <w:pStyle w:val="Luettelokappale"/>
+        <w:numPr>
+          <w:ilvl w:val="1"/>
+          <w:numId w:val="10"/>
+        </w:numPr>
+        <w:rPr>
+          <w:b/>
+          <w:bCs/>
+          <w:lang w:val="en-GB"/>
+        </w:rPr>
+      </w:pPr>
+      <w:r>
+        <w:rPr>
+          <w:lang w:val="en-GB"/>
+        </w:rPr>
+        <w:t xml:space="preserve">There should also be an individual area on the main screen per player, which could host mail, for example. </w:t>
+      </w:r>
+    </w:p>
+    <w:p>
+      <w:pPr>
+        <w:pStyle w:val="Luettelokappale"/>
+        <w:numPr>
+          <w:ilvl w:val="1"/>
+          <w:numId w:val="10"/>
+        </w:numPr>
+        <w:rPr>
+          <w:b/>
+          <w:bCs/>
+          <w:lang w:val="en-GB"/>
+        </w:rPr>
+      </w:pPr>
+      <w:r>
+        <w:rPr>
+          <w:lang w:val="en-GB"/>
+        </w:rPr>
+        <w:t>The main screen hosts for both players and keepers and reflect the societal influence of the scene. As the game progresses, establishments are influenced by game events.</w:t>
+      </w:r>
+    </w:p>
+    <w:p>
+      <w:pPr>
+        <w:pStyle w:val="Luettelokappale"/>
+        <w:numPr>
+          <w:ilvl w:val="0"/>
+          <w:numId w:val="10"/>
+        </w:numPr>
+        <w:rPr>
+          <w:b/>
+          <w:bCs/>
+          <w:lang w:val="en-GB"/>
+        </w:rPr>
+      </w:pPr>
+      <w:r>
+        <w:rPr>
+          <w:b/>
+          <w:bCs/>
+          <w:lang w:val="en-GB"/>
+        </w:rPr>
+        <w:t xml:space="preserve">Priority: </w:t>
+      </w:r>
+      <w:r>
+        <w:rPr>
+          <w:lang w:val="en-GB"/>
+        </w:rPr>
+        <w:t>High (this is a very important screen.)</w:t>
+      </w:r>
+    </w:p>
+    <w:p>
+      <w:pPr>
+        <w:pStyle w:val="Luettelokappale"/>
+        <w:numPr>
+          <w:ilvl w:val="0"/>
+          <w:numId w:val="10"/>
+        </w:numPr>
+        <w:rPr>
+          <w:b/>
+          <w:bCs/>
+          <w:lang w:val="en-GB"/>
+        </w:rPr>
+      </w:pPr>
+      <w:r>
+        <w:rPr>
+          <w:b/>
+          <w:bCs/>
+          <w:lang w:val="en-GB"/>
+        </w:rPr>
+        <w:t>Blocking:</w:t>
+      </w:r>
+      <w:r>
+        <w:rPr>
+          <w:lang w:val="en-GB"/>
+        </w:rPr>
+        <w:t xml:space="preserve"> Yes.</w:t>
+      </w:r>
+    </w:p>
+    <w:p>
+      <w:pPr>
+        <w:rPr>
+          <w:b/>
+          <w:bCs/>
+          <w:lang w:val="en-GB"/>
+        </w:rPr>
+      </w:pPr>
+    </w:p>
+    <w:p>
+      <w:pPr>
+        <w:pStyle w:val="Luettelokappale"/>
+        <w:numPr>
+          <w:ilvl w:val="0"/>
+          <w:numId w:val="11"/>
+        </w:numPr>
+        <w:rPr>
+          <w:b/>
+          <w:bCs/>
+          <w:lang w:val="en-GB"/>
+        </w:rPr>
+      </w:pPr>
+      <w:r>
+        <w:rPr>
+          <w:b/>
+          <w:bCs/>
+          <w:lang w:val="en-GB"/>
+        </w:rPr>
+        <w:br/>
+      </w:r>
+    </w:p>
+    <w:p>
+      <w:pPr>
+        <w:pStyle w:val="Luettelokappale"/>
+        <w:ind w:left="360"/>
+        <w:rPr>
+          <w:b/>
+          <w:bCs/>
+          <w:lang w:val="en-GB"/>
+        </w:rPr>
+      </w:pPr>
+      <w:r>
+        <w:rPr>
+          <w:b/>
+          <w:bCs/>
+          <w:lang w:val="en-GB"/>
+        </w:rPr>
+        <w:t>QIP – 011 – Conceptualizing the Gestation Screen</w:t>
+      </w:r>
+    </w:p>
+    <w:p>
+      <w:pPr>
+        <w:pStyle w:val="Luettelokappale"/>
+        <w:ind w:left="360"/>
+        <w:rPr>
+          <w:b/>
+          <w:bCs/>
+          <w:lang w:val="en-GB"/>
+        </w:rPr>
+      </w:pPr>
+    </w:p>
+    <w:p>
+      <w:pPr>
+        <w:pStyle w:val="Luettelokappale"/>
+        <w:numPr>
+          <w:ilvl w:val="0"/>
+          <w:numId w:val="10"/>
+        </w:numPr>
+        <w:rPr>
+          <w:b/>
+          <w:bCs/>
+          <w:lang w:val="en-GB"/>
+        </w:rPr>
+      </w:pPr>
+      <w:r>
+        <w:rPr>
+          <w:b/>
+          <w:bCs/>
+          <w:lang w:val="en-GB"/>
+        </w:rPr>
+        <w:t xml:space="preserve">Title: </w:t>
+      </w:r>
+      <w:r>
+        <w:rPr>
+          <w:lang w:val="en-GB"/>
+        </w:rPr>
+        <w:t xml:space="preserve">The </w:t>
+      </w:r>
+      <w:r>
+        <w:rPr>
+          <w:lang w:val="en-GB"/>
+        </w:rPr>
+        <w:t>Gestation Screen (accessible for all players)</w:t>
+      </w:r>
+    </w:p>
+    <w:p>
+      <w:pPr>
+        <w:pStyle w:val="Luettelokappale"/>
+        <w:numPr>
+          <w:ilvl w:val="0"/>
+          <w:numId w:val="10"/>
+        </w:numPr>
+        <w:rPr>
+          <w:b/>
+          <w:bCs/>
+          <w:lang w:val="en-GB"/>
+        </w:rPr>
+      </w:pPr>
+      <w:r>
+        <w:rPr>
+          <w:b/>
+          <w:bCs/>
+          <w:lang w:val="en-GB"/>
+        </w:rPr>
+        <w:t>Category:</w:t>
+      </w:r>
+      <w:r>
+        <w:rPr>
+          <w:lang w:val="en-GB"/>
+        </w:rPr>
+        <w:t xml:space="preserve"> UI &amp; Central Game Play Mechanics</w:t>
+      </w:r>
+    </w:p>
+    <w:p>
+      <w:pPr>
+        <w:pStyle w:val="Luettelokappale"/>
+        <w:numPr>
+          <w:ilvl w:val="0"/>
+          <w:numId w:val="10"/>
+        </w:numPr>
+        <w:rPr>
+          <w:b/>
+          <w:bCs/>
+          <w:lang w:val="en-GB"/>
+        </w:rPr>
+      </w:pPr>
+      <w:r>
+        <w:rPr>
+          <w:b/>
+          <w:bCs/>
+          <w:lang w:val="en-GB"/>
+        </w:rPr>
+        <w:t>Question / Idea:</w:t>
+      </w:r>
+      <w:r>
+        <w:rPr>
+          <w:lang w:val="en-GB"/>
+        </w:rPr>
+        <w:br/>
+        <w:t xml:space="preserve">What does the </w:t>
+      </w:r>
+      <w:r>
+        <w:rPr>
+          <w:lang w:val="en-GB"/>
+        </w:rPr>
+        <w:t>gestation</w:t>
+      </w:r>
+      <w:r>
+        <w:rPr>
+          <w:lang w:val="en-GB"/>
+        </w:rPr>
+        <w:t xml:space="preserve"> game screen look</w:t>
+      </w:r>
+      <w:r>
+        <w:rPr>
+          <w:lang w:val="en-GB"/>
+        </w:rPr>
+        <w:t xml:space="preserve"> like</w:t>
+      </w:r>
+      <w:r>
+        <w:rPr>
+          <w:lang w:val="en-GB"/>
+        </w:rPr>
+        <w:t xml:space="preserve">? </w:t>
+      </w:r>
+      <w:r>
+        <w:rPr>
+          <w:lang w:val="en-GB"/>
+        </w:rPr>
+        <w:t>How does it make “the outside world” accessible to players?</w:t>
+      </w:r>
+    </w:p>
+    <w:p>
+      <w:pPr>
+        <w:pStyle w:val="Luettelokappale"/>
+        <w:numPr>
+          <w:ilvl w:val="0"/>
+          <w:numId w:val="10"/>
+        </w:numPr>
+        <w:rPr>
+          <w:b/>
+          <w:bCs/>
+          <w:lang w:val="en-GB"/>
+        </w:rPr>
+      </w:pPr>
+      <w:r>
+        <w:rPr>
+          <w:b/>
+          <w:bCs/>
+          <w:lang w:val="en-GB"/>
+        </w:rPr>
+        <w:t>Current Thought:</w:t>
+      </w:r>
+    </w:p>
+    <w:p>
+      <w:pPr>
+        <w:pStyle w:val="Luettelokappale"/>
+        <w:numPr>
+          <w:ilvl w:val="1"/>
+          <w:numId w:val="10"/>
+        </w:numPr>
+        <w:rPr>
+          <w:b/>
+          <w:bCs/>
+          <w:lang w:val="en-GB"/>
+        </w:rPr>
+      </w:pPr>
+      <w:r>
+        <w:rPr>
+          <w:lang w:val="en-GB"/>
+        </w:rPr>
+        <w:t>The outside world is shared by all the players. Could be a spread sheet containing Game Entity Structures for now.</w:t>
+      </w:r>
+    </w:p>
+    <w:p>
+      <w:pPr>
+        <w:pStyle w:val="Luettelokappale"/>
+        <w:numPr>
+          <w:ilvl w:val="0"/>
+          <w:numId w:val="10"/>
+        </w:numPr>
+        <w:rPr>
+          <w:b/>
+          <w:bCs/>
+          <w:lang w:val="en-GB"/>
+        </w:rPr>
+      </w:pPr>
+      <w:r>
+        <w:rPr>
+          <w:b/>
+          <w:bCs/>
+          <w:lang w:val="en-GB"/>
+        </w:rPr>
+        <w:t xml:space="preserve">Priority: </w:t>
+      </w:r>
+      <w:r>
+        <w:rPr>
+          <w:lang w:val="en-GB"/>
+        </w:rPr>
+        <w:t>High (this is a very important screen.)</w:t>
+      </w:r>
+    </w:p>
+    <w:p>
+      <w:pPr>
+        <w:pStyle w:val="Luettelokappale"/>
+        <w:numPr>
+          <w:ilvl w:val="0"/>
+          <w:numId w:val="10"/>
+        </w:numPr>
+        <w:rPr>
+          <w:b/>
+          <w:bCs/>
+          <w:lang w:val="en-GB"/>
+        </w:rPr>
+      </w:pPr>
+      <w:r>
+        <w:rPr>
+          <w:b/>
+          <w:bCs/>
+          <w:lang w:val="en-GB"/>
+        </w:rPr>
+        <w:t>Blocking:</w:t>
+      </w:r>
+      <w:r>
+        <w:rPr>
+          <w:lang w:val="en-GB"/>
+        </w:rPr>
+        <w:t xml:space="preserve"> Yes.</w:t>
+      </w:r>
+    </w:p>
+    <w:p>
+      <w:pPr>
+        <w:pStyle w:val="Luettelokappale"/>
+        <w:ind w:left="360"/>
+        <w:rPr>
+          <w:b/>
+          <w:bCs/>
+          <w:lang w:val="en-GB"/>
+        </w:rPr>
+      </w:pPr>
+    </w:p>
+    <w:p>
+      <w:pPr>
+        <w:pStyle w:val="Luettelokappale"/>
+        <w:ind w:left="360"/>
+        <w:rPr>
+          <w:b/>
+          <w:bCs/>
+          <w:lang w:val="en-GB"/>
+        </w:rPr>
+      </w:pPr>
+    </w:p>
+    <w:p>
+      <w:pPr>
+        <w:pStyle w:val="Luettelokappale"/>
+        <w:numPr>
+          <w:ilvl w:val="0"/>
+          <w:numId w:val="11"/>
+        </w:numPr>
+        <w:rPr>
+          <w:b/>
+          <w:bCs/>
+          <w:lang w:val="en-GB"/>
+        </w:rPr>
+      </w:pPr>
+      <w:r>
+        <w:rPr>
+          <w:b/>
+          <w:bCs/>
+          <w:lang w:val="en-GB"/>
+        </w:rPr>
+        <w:br/>
+      </w:r>
+    </w:p>
+    <w:p>
+      <w:pPr>
+        <w:pStyle w:val="Luettelokappale"/>
+        <w:ind w:left="360"/>
+        <w:rPr>
+          <w:b/>
+          <w:bCs/>
+          <w:lang w:val="en-GB"/>
+        </w:rPr>
+      </w:pPr>
+      <w:r>
+        <w:rPr>
+          <w:b/>
+          <w:bCs/>
+          <w:lang w:val="en-GB"/>
+        </w:rPr>
+        <w:t>QIP – 012 – Conceptualizing the Rehearsal Screen</w:t>
+      </w:r>
+    </w:p>
+    <w:p>
+      <w:pPr>
+        <w:pStyle w:val="Luettelokappale"/>
+        <w:ind w:left="360"/>
+        <w:rPr>
+          <w:b/>
+          <w:bCs/>
+          <w:lang w:val="en-GB"/>
+        </w:rPr>
+      </w:pPr>
+    </w:p>
+    <w:p>
+      <w:pPr>
+        <w:pStyle w:val="Luettelokappale"/>
+        <w:numPr>
+          <w:ilvl w:val="0"/>
+          <w:numId w:val="10"/>
+        </w:numPr>
+        <w:rPr>
+          <w:b/>
+          <w:bCs/>
+          <w:lang w:val="en-GB"/>
+        </w:rPr>
+      </w:pPr>
+      <w:r>
+        <w:rPr>
+          <w:b/>
+          <w:bCs/>
+          <w:lang w:val="en-GB"/>
+        </w:rPr>
+        <w:t xml:space="preserve">Title: </w:t>
+      </w:r>
+      <w:r>
+        <w:rPr>
+          <w:lang w:val="en-GB"/>
+        </w:rPr>
+        <w:t xml:space="preserve">The </w:t>
+      </w:r>
+      <w:r>
+        <w:rPr>
+          <w:lang w:val="en-GB"/>
+        </w:rPr>
+        <w:t>Rehearsal Screen (accessible for all non-Keeper players)</w:t>
+      </w:r>
+    </w:p>
+    <w:p>
+      <w:pPr>
+        <w:pStyle w:val="Luettelokappale"/>
+        <w:numPr>
+          <w:ilvl w:val="0"/>
+          <w:numId w:val="10"/>
+        </w:numPr>
+        <w:rPr>
+          <w:b/>
+          <w:bCs/>
+          <w:lang w:val="en-GB"/>
+        </w:rPr>
+      </w:pPr>
+      <w:r>
+        <w:rPr>
+          <w:b/>
+          <w:bCs/>
+          <w:lang w:val="en-GB"/>
+        </w:rPr>
+        <w:t>Category:</w:t>
+      </w:r>
+      <w:r>
+        <w:rPr>
+          <w:lang w:val="en-GB"/>
+        </w:rPr>
+        <w:t xml:space="preserve"> UI &amp; Central Game Play Mechanics</w:t>
+      </w:r>
+    </w:p>
+    <w:p>
+      <w:pPr>
+        <w:pStyle w:val="Luettelokappale"/>
+        <w:numPr>
+          <w:ilvl w:val="0"/>
+          <w:numId w:val="10"/>
+        </w:numPr>
+        <w:rPr>
+          <w:b/>
+          <w:bCs/>
+          <w:lang w:val="en-GB"/>
+        </w:rPr>
+      </w:pPr>
+      <w:r>
+        <w:rPr>
+          <w:b/>
+          <w:bCs/>
+          <w:lang w:val="en-GB"/>
+        </w:rPr>
+        <w:t>Question / Idea:</w:t>
+      </w:r>
+      <w:r>
+        <w:rPr>
+          <w:lang w:val="en-GB"/>
+        </w:rPr>
+        <w:br/>
+      </w:r>
+      <w:r>
+        <w:rPr>
+          <w:lang w:val="en-GB"/>
+        </w:rPr>
+        <w:t>What does the rehearsal space look like</w:t>
+      </w:r>
+      <w:r>
+        <w:rPr>
+          <w:lang w:val="en-GB"/>
+        </w:rPr>
+        <w:t xml:space="preserve">? </w:t>
+      </w:r>
+    </w:p>
+    <w:p>
+      <w:pPr>
+        <w:pStyle w:val="Luettelokappale"/>
+        <w:numPr>
+          <w:ilvl w:val="0"/>
+          <w:numId w:val="10"/>
+        </w:numPr>
+        <w:rPr>
+          <w:b/>
+          <w:bCs/>
+          <w:lang w:val="en-GB"/>
+        </w:rPr>
+      </w:pPr>
+      <w:r>
+        <w:rPr>
+          <w:b/>
+          <w:bCs/>
+          <w:lang w:val="en-GB"/>
+        </w:rPr>
+        <w:t>Current Thought:</w:t>
+      </w:r>
+    </w:p>
+    <w:p>
+      <w:pPr>
+        <w:pStyle w:val="Luettelokappale"/>
+        <w:numPr>
+          <w:ilvl w:val="1"/>
+          <w:numId w:val="10"/>
+        </w:numPr>
+        <w:rPr>
+          <w:b/>
+          <w:bCs/>
+          <w:lang w:val="en-GB"/>
+        </w:rPr>
+      </w:pPr>
+      <w:r>
+        <w:rPr>
+          <w:lang w:val="en-GB"/>
+        </w:rPr>
+        <w:t xml:space="preserve">Could be the same all, but </w:t>
+      </w:r>
+      <w:r>
+        <w:rPr>
+          <w:lang w:val="en-GB"/>
+        </w:rPr>
+        <w:t>later</w:t>
+      </w:r>
+      <w:r>
+        <w:rPr>
+          <w:lang w:val="en-GB"/>
+        </w:rPr>
+        <w:t xml:space="preserve"> modifiable and reflective of the band members.</w:t>
+      </w:r>
+    </w:p>
+    <w:p>
+      <w:pPr>
+        <w:pStyle w:val="Luettelokappale"/>
+        <w:numPr>
+          <w:ilvl w:val="0"/>
+          <w:numId w:val="10"/>
+        </w:numPr>
+        <w:rPr>
+          <w:b/>
+          <w:bCs/>
+          <w:lang w:val="en-GB"/>
+        </w:rPr>
+      </w:pPr>
+      <w:r>
+        <w:rPr>
+          <w:b/>
+          <w:bCs/>
+          <w:lang w:val="en-GB"/>
+        </w:rPr>
+        <w:t xml:space="preserve">Priority: </w:t>
+      </w:r>
+      <w:r>
+        <w:rPr>
+          <w:lang w:val="en-GB"/>
+        </w:rPr>
+        <w:t>High (this is a very important screen.)</w:t>
+      </w:r>
+    </w:p>
+    <w:p>
+      <w:pPr>
+        <w:pStyle w:val="Luettelokappale"/>
+        <w:numPr>
+          <w:ilvl w:val="0"/>
+          <w:numId w:val="10"/>
+        </w:numPr>
+        <w:rPr>
+          <w:b/>
+          <w:bCs/>
+          <w:lang w:val="en-GB"/>
+        </w:rPr>
+      </w:pPr>
+      <w:r>
+        <w:rPr>
+          <w:b/>
+          <w:bCs/>
+          <w:lang w:val="en-GB"/>
+        </w:rPr>
+        <w:t>Blocking:</w:t>
+      </w:r>
+      <w:r>
+        <w:rPr>
+          <w:lang w:val="en-GB"/>
+        </w:rPr>
+        <w:t xml:space="preserve"> Yes.</w:t>
+      </w:r>
+    </w:p>
+    <w:p>
+      <w:pPr>
+        <w:pStyle w:val="Luettelokappale"/>
+        <w:ind w:left="360"/>
+        <w:rPr>
+          <w:b/>
+          <w:bCs/>
+          <w:lang w:val="en-GB"/>
+        </w:rPr>
+      </w:pPr>
+    </w:p>
+    <w:p>
+      <w:pPr>
+        <w:pStyle w:val="Luettelokappale"/>
+        <w:ind w:left="360"/>
+        <w:rPr>
+          <w:b/>
+          <w:bCs/>
+          <w:lang w:val="en-GB"/>
+        </w:rPr>
+      </w:pPr>
+    </w:p>
+    <w:p>
+      <w:pPr>
+        <w:pStyle w:val="Luettelokappale"/>
+        <w:numPr>
+          <w:ilvl w:val="0"/>
+          <w:numId w:val="11"/>
+        </w:numPr>
+        <w:rPr>
+          <w:b/>
+          <w:bCs/>
+          <w:lang w:val="en-GB"/>
+        </w:rPr>
+      </w:pPr>
+      <w:r>
+        <w:rPr>
+          <w:b/>
+          <w:bCs/>
+          <w:lang w:val="en-GB"/>
+        </w:rPr>
+        <w:br/>
+      </w:r>
+    </w:p>
+    <w:p>
+      <w:pPr>
+        <w:pStyle w:val="Luettelokappale"/>
+        <w:ind w:left="360"/>
+        <w:rPr>
+          <w:b/>
+          <w:bCs/>
+          <w:lang w:val="en-GB"/>
+        </w:rPr>
+      </w:pPr>
+      <w:r>
+        <w:rPr>
+          <w:b/>
+          <w:bCs/>
+          <w:lang w:val="en-GB"/>
+        </w:rPr>
+        <w:t>QIP – 013 – Conceptualizing the Promotion Screen</w:t>
+      </w:r>
+    </w:p>
+    <w:p>
+      <w:pPr>
+        <w:pStyle w:val="Luettelokappale"/>
+        <w:ind w:left="360"/>
+        <w:rPr>
+          <w:b/>
+          <w:bCs/>
+          <w:lang w:val="en-GB"/>
+        </w:rPr>
+      </w:pPr>
+    </w:p>
+    <w:p>
+      <w:pPr>
+        <w:pStyle w:val="Luettelokappale"/>
+        <w:numPr>
+          <w:ilvl w:val="0"/>
+          <w:numId w:val="10"/>
+        </w:numPr>
+        <w:rPr>
+          <w:b/>
+          <w:bCs/>
+          <w:lang w:val="en-GB"/>
+        </w:rPr>
+      </w:pPr>
+      <w:r>
+        <w:rPr>
+          <w:b/>
+          <w:bCs/>
+          <w:lang w:val="en-GB"/>
+        </w:rPr>
+        <w:t xml:space="preserve">Title: </w:t>
+      </w:r>
+      <w:r>
+        <w:rPr>
+          <w:lang w:val="en-GB"/>
+        </w:rPr>
+        <w:t xml:space="preserve">The </w:t>
+      </w:r>
+      <w:r>
+        <w:rPr>
+          <w:lang w:val="en-GB"/>
+        </w:rPr>
+        <w:t>Promotion Screen (accessible for all players)</w:t>
+      </w:r>
+    </w:p>
+    <w:p>
+      <w:pPr>
+        <w:pStyle w:val="Luettelokappale"/>
+        <w:numPr>
+          <w:ilvl w:val="0"/>
+          <w:numId w:val="10"/>
+        </w:numPr>
+        <w:rPr>
+          <w:b/>
+          <w:bCs/>
+          <w:lang w:val="en-GB"/>
+        </w:rPr>
+      </w:pPr>
+      <w:r>
+        <w:rPr>
+          <w:b/>
+          <w:bCs/>
+          <w:lang w:val="en-GB"/>
+        </w:rPr>
+        <w:t>Category:</w:t>
+      </w:r>
+      <w:r>
+        <w:rPr>
+          <w:lang w:val="en-GB"/>
+        </w:rPr>
+        <w:t xml:space="preserve"> UI &amp; Central Game Play Mechanics</w:t>
+      </w:r>
+    </w:p>
+    <w:p>
+      <w:pPr>
+        <w:pStyle w:val="Luettelokappale"/>
+        <w:numPr>
+          <w:ilvl w:val="0"/>
+          <w:numId w:val="10"/>
+        </w:numPr>
+        <w:rPr>
+          <w:b/>
+          <w:bCs/>
+          <w:lang w:val="en-GB"/>
+        </w:rPr>
+      </w:pPr>
+      <w:r>
+        <w:rPr>
+          <w:b/>
+          <w:bCs/>
+          <w:lang w:val="en-GB"/>
+        </w:rPr>
+        <w:t>Question / Idea:</w:t>
+      </w:r>
+      <w:r>
+        <w:rPr>
+          <w:lang w:val="en-GB"/>
+        </w:rPr>
+        <w:br/>
+      </w:r>
+      <w:r>
+        <w:rPr>
+          <w:lang w:val="en-GB"/>
+        </w:rPr>
+        <w:t>What is this even?</w:t>
+      </w:r>
+    </w:p>
+    <w:p>
+      <w:pPr>
+        <w:pStyle w:val="Luettelokappale"/>
+        <w:numPr>
+          <w:ilvl w:val="0"/>
+          <w:numId w:val="10"/>
+        </w:numPr>
+        <w:rPr>
+          <w:b/>
+          <w:bCs/>
+          <w:lang w:val="en-GB"/>
+        </w:rPr>
+      </w:pPr>
+      <w:r>
+        <w:rPr>
+          <w:b/>
+          <w:bCs/>
+          <w:lang w:val="en-GB"/>
+        </w:rPr>
+        <w:t>Current Thought:</w:t>
+      </w:r>
+    </w:p>
+    <w:p>
+      <w:pPr>
+        <w:pStyle w:val="Luettelokappale"/>
+        <w:numPr>
+          <w:ilvl w:val="1"/>
+          <w:numId w:val="10"/>
+        </w:numPr>
+        <w:rPr>
+          <w:b/>
+          <w:bCs/>
+          <w:lang w:val="en-GB"/>
+        </w:rPr>
+      </w:pPr>
+      <w:r>
+        <w:rPr>
+          <w:lang w:val="en-GB"/>
+        </w:rPr>
+        <w:t xml:space="preserve">I have given </w:t>
+      </w:r>
+      <w:r>
+        <w:rPr>
+          <w:lang w:val="en-GB"/>
+        </w:rPr>
+        <w:t>these zero thoughts</w:t>
+      </w:r>
+      <w:r>
+        <w:rPr>
+          <w:lang w:val="en-GB"/>
+        </w:rPr>
+        <w:t>.</w:t>
+      </w:r>
+    </w:p>
+    <w:p>
+      <w:pPr>
+        <w:pStyle w:val="Luettelokappale"/>
+        <w:numPr>
+          <w:ilvl w:val="0"/>
+          <w:numId w:val="10"/>
+        </w:numPr>
+        <w:rPr>
+          <w:b/>
+          <w:bCs/>
+          <w:lang w:val="en-GB"/>
+        </w:rPr>
+      </w:pPr>
+      <w:r>
+        <w:rPr>
+          <w:b/>
+          <w:bCs/>
+          <w:lang w:val="en-GB"/>
+        </w:rPr>
+        <w:t xml:space="preserve">Priority: </w:t>
+      </w:r>
+      <w:r>
+        <w:rPr>
+          <w:lang w:val="en-GB"/>
+        </w:rPr>
+        <w:t>High (this is a very important screen.)</w:t>
+      </w:r>
+    </w:p>
+    <w:p>
+      <w:pPr>
+        <w:pStyle w:val="Luettelokappale"/>
+        <w:numPr>
+          <w:ilvl w:val="0"/>
+          <w:numId w:val="10"/>
+        </w:numPr>
+        <w:rPr>
+          <w:b/>
+          <w:bCs/>
+          <w:lang w:val="en-GB"/>
+        </w:rPr>
+      </w:pPr>
+      <w:r>
+        <w:rPr>
+          <w:b/>
+          <w:bCs/>
+          <w:lang w:val="en-GB"/>
+        </w:rPr>
+        <w:t>Blocking:</w:t>
+      </w:r>
+      <w:r>
+        <w:rPr>
+          <w:lang w:val="en-GB"/>
+        </w:rPr>
+        <w:t xml:space="preserve"> Yes.</w:t>
+      </w:r>
+    </w:p>
+    <w:p>
+      <w:pPr>
+        <w:pStyle w:val="Luettelokappale"/>
+        <w:ind w:left="360"/>
+        <w:rPr>
+          <w:b/>
+          <w:bCs/>
+          <w:lang w:val="en-GB"/>
+        </w:rPr>
+      </w:pPr>
+    </w:p>
+    <w:p>
+      <w:pPr>
+        <w:pStyle w:val="Luettelokappale"/>
+        <w:ind w:left="360"/>
+        <w:rPr>
+          <w:b/>
+          <w:bCs/>
+          <w:lang w:val="en-GB"/>
+        </w:rPr>
+      </w:pPr>
+    </w:p>
+    <w:p>
+      <w:pPr>
+        <w:pStyle w:val="Luettelokappale"/>
+        <w:numPr>
+          <w:ilvl w:val="0"/>
+          <w:numId w:val="11"/>
+        </w:numPr>
+        <w:rPr>
+          <w:b/>
+          <w:bCs/>
+          <w:lang w:val="en-GB"/>
+        </w:rPr>
+      </w:pPr>
+      <w:r>
+        <w:rPr>
+          <w:b/>
+          <w:bCs/>
+          <w:lang w:val="en-GB"/>
+        </w:rPr>
+        <w:br/>
+      </w:r>
+    </w:p>
+    <w:p>
+      <w:pPr>
+        <w:pStyle w:val="Luettelokappale"/>
+        <w:ind w:left="360"/>
+        <w:rPr>
+          <w:b/>
+          <w:bCs/>
+          <w:lang w:val="en-GB"/>
+        </w:rPr>
+      </w:pPr>
+      <w:r>
+        <w:rPr>
+          <w:b/>
+          <w:bCs/>
+          <w:lang w:val="en-GB"/>
+        </w:rPr>
+        <w:t>QIP – 01</w:t>
+      </w:r>
+      <w:r>
+        <w:rPr>
+          <w:b/>
+          <w:bCs/>
+          <w:lang w:val="en-GB"/>
+        </w:rPr>
+        <w:t>4</w:t>
+      </w:r>
+      <w:r>
+        <w:rPr>
+          <w:b/>
+          <w:bCs/>
+          <w:lang w:val="en-GB"/>
+        </w:rPr>
+        <w:t xml:space="preserve"> – Conceptualizing the </w:t>
+      </w:r>
+      <w:r>
+        <w:rPr>
+          <w:b/>
+          <w:bCs/>
+          <w:lang w:val="en-GB"/>
+        </w:rPr>
+        <w:t>Keeper Ledger/Band Roster</w:t>
+      </w:r>
+    </w:p>
+    <w:p>
+      <w:pPr>
+        <w:pStyle w:val="Luettelokappale"/>
+        <w:ind w:left="360"/>
+        <w:rPr>
+          <w:b/>
+          <w:bCs/>
+          <w:lang w:val="en-GB"/>
+        </w:rPr>
+      </w:pPr>
+    </w:p>
+    <w:p>
+      <w:pPr>
+        <w:pStyle w:val="Luettelokappale"/>
+        <w:numPr>
+          <w:ilvl w:val="0"/>
+          <w:numId w:val="10"/>
+        </w:numPr>
+        <w:rPr>
+          <w:b/>
+          <w:bCs/>
+          <w:lang w:val="en-GB"/>
+        </w:rPr>
+      </w:pPr>
+      <w:r>
+        <w:rPr>
+          <w:b/>
+          <w:bCs/>
+          <w:lang w:val="en-GB"/>
+        </w:rPr>
+        <w:t xml:space="preserve">Title: </w:t>
+      </w:r>
+      <w:r>
+        <w:rPr>
+          <w:lang w:val="en-GB"/>
+        </w:rPr>
+        <w:t>A folding ledger at the left side of the main screen.</w:t>
+      </w:r>
+    </w:p>
+    <w:p>
+      <w:pPr>
+        <w:pStyle w:val="Luettelokappale"/>
+        <w:numPr>
+          <w:ilvl w:val="0"/>
+          <w:numId w:val="10"/>
+        </w:numPr>
+        <w:rPr>
+          <w:b/>
+          <w:bCs/>
+          <w:lang w:val="en-GB"/>
+        </w:rPr>
+      </w:pPr>
+      <w:r>
+        <w:rPr>
+          <w:b/>
+          <w:bCs/>
+          <w:lang w:val="en-GB"/>
+        </w:rPr>
+        <w:t>Category:</w:t>
+      </w:r>
+      <w:r>
+        <w:rPr>
+          <w:lang w:val="en-GB"/>
+        </w:rPr>
+        <w:t xml:space="preserve"> UI &amp; Central Game Play Mechanics</w:t>
+      </w:r>
+    </w:p>
+    <w:p>
+      <w:pPr>
+        <w:pStyle w:val="Luettelokappale"/>
+        <w:numPr>
+          <w:ilvl w:val="0"/>
+          <w:numId w:val="10"/>
+        </w:numPr>
+        <w:rPr>
+          <w:b/>
+          <w:bCs/>
+          <w:lang w:val="en-GB"/>
+        </w:rPr>
+      </w:pPr>
+      <w:r>
+        <w:rPr>
+          <w:b/>
+          <w:bCs/>
+          <w:lang w:val="en-GB"/>
+        </w:rPr>
+        <w:t>Question / Idea:</w:t>
+      </w:r>
+      <w:r>
+        <w:rPr>
+          <w:lang w:val="en-GB"/>
+        </w:rPr>
+        <w:br/>
+      </w:r>
+      <w:r>
+        <w:rPr>
+          <w:lang w:val="en-GB"/>
+        </w:rPr>
+        <w:t>A folding ledger provides access to the free player actions, and keeper actions.</w:t>
+      </w:r>
+    </w:p>
+    <w:p>
+      <w:pPr>
+        <w:pStyle w:val="Luettelokappale"/>
+        <w:numPr>
+          <w:ilvl w:val="0"/>
+          <w:numId w:val="10"/>
+        </w:numPr>
+        <w:rPr>
+          <w:b/>
+          <w:bCs/>
+          <w:lang w:val="en-GB"/>
+        </w:rPr>
+      </w:pPr>
+      <w:r>
+        <w:rPr>
+          <w:b/>
+          <w:bCs/>
+          <w:lang w:val="en-GB"/>
+        </w:rPr>
+        <w:t>Current Thought:</w:t>
+      </w:r>
+    </w:p>
+    <w:p>
+      <w:pPr>
+        <w:pStyle w:val="Luettelokappale"/>
+        <w:numPr>
+          <w:ilvl w:val="1"/>
+          <w:numId w:val="10"/>
+        </w:numPr>
+        <w:rPr>
+          <w:b/>
+          <w:bCs/>
+          <w:lang w:val="en-GB"/>
+        </w:rPr>
+      </w:pPr>
+      <w:r>
+        <w:rPr>
+          <w:lang w:val="en-GB"/>
+        </w:rPr>
+        <w:t>For keepers, the keeper actions are located on this ledger.</w:t>
+      </w:r>
+    </w:p>
+    <w:p>
+      <w:pPr>
+        <w:pStyle w:val="Luettelokappale"/>
+        <w:numPr>
+          <w:ilvl w:val="1"/>
+          <w:numId w:val="10"/>
+        </w:numPr>
+        <w:rPr>
+          <w:b/>
+          <w:bCs/>
+          <w:lang w:val="en-GB"/>
+        </w:rPr>
+      </w:pPr>
+      <w:r>
+        <w:rPr>
+          <w:lang w:val="en-GB"/>
+        </w:rPr>
+        <w:t>For other players, direct access to band members and other characters are here. All the free actions are executed here.</w:t>
+      </w:r>
+    </w:p>
+    <w:p>
+      <w:pPr>
+        <w:pStyle w:val="Luettelokappale"/>
+        <w:numPr>
+          <w:ilvl w:val="0"/>
+          <w:numId w:val="10"/>
+        </w:numPr>
+        <w:rPr>
+          <w:b/>
+          <w:bCs/>
+          <w:lang w:val="en-GB"/>
+        </w:rPr>
+      </w:pPr>
+      <w:r>
+        <w:rPr>
+          <w:b/>
+          <w:bCs/>
+          <w:lang w:val="en-GB"/>
+        </w:rPr>
+        <w:t xml:space="preserve">Priority: </w:t>
+      </w:r>
+      <w:r>
+        <w:rPr>
+          <w:lang w:val="en-GB"/>
+        </w:rPr>
+        <w:t>High (this is a very important screen.)</w:t>
+      </w:r>
+    </w:p>
+    <w:p>
+      <w:pPr>
+        <w:pStyle w:val="Luettelokappale"/>
+        <w:numPr>
+          <w:ilvl w:val="0"/>
+          <w:numId w:val="10"/>
+        </w:numPr>
+        <w:rPr>
+          <w:b/>
+          <w:bCs/>
+          <w:lang w:val="en-GB"/>
+        </w:rPr>
+      </w:pPr>
+      <w:r>
+        <w:rPr>
+          <w:b/>
+          <w:bCs/>
+          <w:lang w:val="en-GB"/>
+        </w:rPr>
+        <w:t>Blocking:</w:t>
+      </w:r>
+      <w:r>
+        <w:rPr>
+          <w:lang w:val="en-GB"/>
+        </w:rPr>
+        <w:t xml:space="preserve"> Yes.</w:t>
+      </w:r>
+    </w:p>
+    <w:p>
+      <w:pPr>
+        <w:pStyle w:val="Luettelokappale"/>
+        <w:ind w:left="360"/>
+        <w:rPr>
+          <w:b/>
+          <w:bCs/>
           <w:lang w:val="en-GB"/>
         </w:rPr>
       </w:pPr>
@@ -2262,6 +3702,31 @@
 
 <file path=word/numbering.xml><?xml version="1.0" encoding="utf-8"?>
 <w:numbering xmlns:wpc="http://schemas.microsoft.com/office/word/2010/wordprocessingCanvas" xmlns:cx="http://schemas.microsoft.com/office/drawing/2014/chartex" xmlns:cx1="http://schemas.microsoft.com/office/drawing/2015/9/8/chartex" xmlns:cx2="http://schemas.microsoft.com/office/drawing/2015/10/21/chartex" xmlns:cx3="http://schemas.microsoft.com/office/drawing/2016/5/9/chartex" xmlns:cx4="http://schemas.microsoft.com/office/drawing/2016/5/10/chartex" xmlns:cx5="http://schemas.microsoft.com/office/drawing/2016/5/11/chartex" xmlns:cx6="http://schemas.microsoft.com/office/drawing/2016/5/12/chartex" xmlns:cx7="http://schemas.microsoft.com/office/drawing/2016/5/13/chartex" xmlns:cx8="http://schemas.microsoft.com/office/drawing/2016/5/14/chartex" xmlns:mc="http://schemas.openxmlformats.org/markup-compatibility/2006" xmlns:aink="http://schemas.microsoft.com/office/drawing/2016/ink" xmlns:am3d="http://schemas.microsoft.com/office/drawing/2017/model3d" xmlns:o="urn:schemas-microsoft-com:office:office" xmlns:oel="http://schemas.microsoft.com/office/2019/extlst" xmlns:r="http://schemas.openxmlformats.org/officeDocument/2006/relationships" xmlns:m="http://schemas.openxmlformats.org/officeDocument/2006/math" xmlns:v="urn:schemas-microsoft-com:vml" xmlns:wp14="http://schemas.microsoft.com/office/word/2010/wordprocessingDrawing" xmlns:wp="http://schemas.openxmlformats.org/drawingml/2006/wordprocessingDrawing" xmlns:w10="urn:schemas-microsoft-com:office:word" xmlns:w="http://schemas.openxmlformats.org/wordprocessingml/2006/main" xmlns:w14="http://schemas.microsoft.com/office/word/2010/wordml" xmlns:w15="http://schemas.microsoft.com/office/word/2012/wordml" xmlns:w16cex="http://schemas.microsoft.com/office/word/2018/wordml/cex" xmlns:w16cid="http://schemas.microsoft.com/office/word/2016/wordml/cid" xmlns:w16="http://schemas.microsoft.com/office/word/2018/wordml" xmlns:w16du="http://schemas.microsoft.com/office/word/2023/wordml/word16du" xmlns:w16sdtdh="http://schemas.microsoft.com/office/word/2020/wordml/sdtdatahash" xmlns:w16sdtfl="http://schemas.microsoft.com/office/word/2024/wordml/sdtformatlock" xmlns:w16se="http://schemas.microsoft.com/office/word/2015/wordml/symex" xmlns:wpg="http://schemas.microsoft.com/office/word/2010/wordprocessingGroup" xmlns:wpi="http://schemas.microsoft.com/office/word/2010/wordprocessingInk" xmlns:wne="http://schemas.microsoft.com/office/word/2006/wordml" xmlns:wps="http://schemas.microsoft.com/office/word/2010/wordprocessingShape" mc:Ignorable="w14 w15 w16se w16cid w16 w16cex w16sdtdh w16sdtfl w16du wp14">
+  <w:numPicBullet w:numPicBulletId="0">
+    <w:pict>
+      <v:rect id="_x0000_i1051" style="width:0;height:1.5pt" o:hralign="center" o:bullet="t" o:hrstd="t" o:hr="t" fillcolor="#a0a0a0" stroked="f"/>
+    </w:pict>
+  </w:numPicBullet>
+  <w:numPicBullet w:numPicBulletId="1">
+    <w:pict>
+      <v:rect id="_x0000_i1052" style="width:0;height:1.5pt" o:hralign="center" o:bullet="t" o:hrstd="t" o:hr="t" fillcolor="#a0a0a0" stroked="f"/>
+    </w:pict>
+  </w:numPicBullet>
+  <w:numPicBullet w:numPicBulletId="2">
+    <w:pict>
+      <v:rect id="_x0000_i1053" style="width:0;height:1.5pt" o:hralign="center" o:bullet="t" o:hrstd="t" o:hr="t" fillcolor="#a0a0a0" stroked="f"/>
+    </w:pict>
+  </w:numPicBullet>
+  <w:numPicBullet w:numPicBulletId="3">
+    <w:pict>
+      <v:rect id="_x0000_i1054" style="width:0;height:1.5pt" o:hralign="center" o:bullet="t" o:hrstd="t" o:hr="t" fillcolor="#a0a0a0" stroked="f"/>
+    </w:pict>
+  </w:numPicBullet>
+  <w:numPicBullet w:numPicBulletId="4">
+    <w:pict>
+      <v:rect id="_x0000_i1055" style="width:0;height:1.5pt" o:hralign="center" o:bullet="t" o:hrstd="t" o:hr="t" fillcolor="#a0a0a0" stroked="f"/>
+    </w:pict>
+  </w:numPicBullet>
   <w:abstractNum w:abstractNumId="0" w15:restartNumberingAfterBreak="0">
     <w:nsid w:val="00CF3EC2"/>
     <w:multiLevelType w:val="multilevel"/>
@@ -2561,6 +4026,120 @@
     </w:lvl>
   </w:abstractNum>
   <w:abstractNum w:abstractNumId="2" w15:restartNumberingAfterBreak="0">
+    <w:nsid w:val="36E11452"/>
+    <w:multiLevelType w:val="hybridMultilevel"/>
+    <w:tmpl w:val="F8BE1BC0"/>
+    <w:lvl w:ilvl="0" w:tplc="F496B2E0">
+      <w:start w:val="1"/>
+      <w:numFmt w:val="bullet"/>
+      <w:lvlText w:val=""/>
+      <w:lvlPicBulletId w:val="4"/>
+      <w:lvlJc w:val="left"/>
+      <w:pPr>
+        <w:ind w:left="360" w:hanging="360"/>
+      </w:pPr>
+      <w:rPr>
+        <w:rFonts w:ascii="Symbol" w:hAnsi="Symbol" w:hint="default"/>
+      </w:rPr>
+    </w:lvl>
+    <w:lvl w:ilvl="1" w:tplc="040B0003" w:tentative="1">
+      <w:start w:val="1"/>
+      <w:numFmt w:val="bullet"/>
+      <w:lvlText w:val="o"/>
+      <w:lvlJc w:val="left"/>
+      <w:pPr>
+        <w:ind w:left="1080" w:hanging="360"/>
+      </w:pPr>
+      <w:rPr>
+        <w:rFonts w:ascii="Courier New" w:hAnsi="Courier New" w:cs="Courier New" w:hint="default"/>
+      </w:rPr>
+    </w:lvl>
+    <w:lvl w:ilvl="2" w:tplc="040B0005" w:tentative="1">
+      <w:start w:val="1"/>
+      <w:numFmt w:val="bullet"/>
+      <w:lvlText w:val=""/>
+      <w:lvlJc w:val="left"/>
+      <w:pPr>
+        <w:ind w:left="1800" w:hanging="360"/>
+      </w:pPr>
+      <w:rPr>
+        <w:rFonts w:ascii="Wingdings" w:hAnsi="Wingdings" w:hint="default"/>
+      </w:rPr>
+    </w:lvl>
+    <w:lvl w:ilvl="3" w:tplc="040B0001" w:tentative="1">
+      <w:start w:val="1"/>
+      <w:numFmt w:val="bullet"/>
+      <w:lvlText w:val=""/>
+      <w:lvlJc w:val="left"/>
+      <w:pPr>
+        <w:ind w:left="2520" w:hanging="360"/>
+      </w:pPr>
+      <w:rPr>
+        <w:rFonts w:ascii="Symbol" w:hAnsi="Symbol" w:hint="default"/>
+      </w:rPr>
+    </w:lvl>
+    <w:lvl w:ilvl="4" w:tplc="040B0003" w:tentative="1">
+      <w:start w:val="1"/>
+      <w:numFmt w:val="bullet"/>
+      <w:lvlText w:val="o"/>
+      <w:lvlJc w:val="left"/>
+      <w:pPr>
+        <w:ind w:left="3240" w:hanging="360"/>
+      </w:pPr>
+      <w:rPr>
+        <w:rFonts w:ascii="Courier New" w:hAnsi="Courier New" w:cs="Courier New" w:hint="default"/>
+      </w:rPr>
+    </w:lvl>
+    <w:lvl w:ilvl="5" w:tplc="040B0005" w:tentative="1">
+      <w:start w:val="1"/>
+      <w:numFmt w:val="bullet"/>
+      <w:lvlText w:val=""/>
+      <w:lvlJc w:val="left"/>
+      <w:pPr>
+        <w:ind w:left="3960" w:hanging="360"/>
+      </w:pPr>
+      <w:rPr>
+        <w:rFonts w:ascii="Wingdings" w:hAnsi="Wingdings" w:hint="default"/>
+      </w:rPr>
+    </w:lvl>
+    <w:lvl w:ilvl="6" w:tplc="040B0001" w:tentative="1">
+      <w:start w:val="1"/>
+      <w:numFmt w:val="bullet"/>
+      <w:lvlText w:val=""/>
+      <w:lvlJc w:val="left"/>
+      <w:pPr>
+        <w:ind w:left="4680" w:hanging="360"/>
+      </w:pPr>
+      <w:rPr>
+        <w:rFonts w:ascii="Symbol" w:hAnsi="Symbol" w:hint="default"/>
+      </w:rPr>
+    </w:lvl>
+    <w:lvl w:ilvl="7" w:tplc="040B0003" w:tentative="1">
+      <w:start w:val="1"/>
+      <w:numFmt w:val="bullet"/>
+      <w:lvlText w:val="o"/>
+      <w:lvlJc w:val="left"/>
+      <w:pPr>
+        <w:ind w:left="5400" w:hanging="360"/>
+      </w:pPr>
+      <w:rPr>
+        <w:rFonts w:ascii="Courier New" w:hAnsi="Courier New" w:cs="Courier New" w:hint="default"/>
+      </w:rPr>
+    </w:lvl>
+    <w:lvl w:ilvl="8" w:tplc="040B0005" w:tentative="1">
+      <w:start w:val="1"/>
+      <w:numFmt w:val="bullet"/>
+      <w:lvlText w:val=""/>
+      <w:lvlJc w:val="left"/>
+      <w:pPr>
+        <w:ind w:left="6120" w:hanging="360"/>
+      </w:pPr>
+      <w:rPr>
+        <w:rFonts w:ascii="Wingdings" w:hAnsi="Wingdings" w:hint="default"/>
+      </w:rPr>
+    </w:lvl>
+  </w:abstractNum>
+  <w:abstractNum w:abstractNumId="3" w15:restartNumberingAfterBreak="0">
     <w:nsid w:val="38AF4A1C"/>
     <w:multiLevelType w:val="multilevel"/>
     <w:tmpl w:val="C5061632"/>
@@ -2709,7 +4288,7 @@
       </w:rPr>
     </w:lvl>
   </w:abstractNum>
-  <w:abstractNum w:abstractNumId="3" w15:restartNumberingAfterBreak="0">
+  <w:abstractNum w:abstractNumId="4" w15:restartNumberingAfterBreak="0">
     <w:nsid w:val="57D85272"/>
     <w:multiLevelType w:val="multilevel"/>
     <w:tmpl w:val="4D0895F4"/>
@@ -2858,7 +4437,7 @@
       </w:rPr>
     </w:lvl>
   </w:abstractNum>
-  <w:abstractNum w:abstractNumId="4" w15:restartNumberingAfterBreak="0">
+  <w:abstractNum w:abstractNumId="5" w15:restartNumberingAfterBreak="0">
     <w:nsid w:val="59FC6A17"/>
     <w:multiLevelType w:val="multilevel"/>
     <w:tmpl w:val="93F0D4FC"/>
@@ -3007,7 +4586,7 @@
       </w:rPr>
     </w:lvl>
   </w:abstractNum>
-  <w:abstractNum w:abstractNumId="5" w15:restartNumberingAfterBreak="0">
+  <w:abstractNum w:abstractNumId="6" w15:restartNumberingAfterBreak="0">
     <w:nsid w:val="5A9F4F1A"/>
     <w:multiLevelType w:val="multilevel"/>
     <w:tmpl w:val="B92A1D86"/>
@@ -3156,7 +4735,7 @@
       </w:rPr>
     </w:lvl>
   </w:abstractNum>
-  <w:abstractNum w:abstractNumId="6" w15:restartNumberingAfterBreak="0">
+  <w:abstractNum w:abstractNumId="7" w15:restartNumberingAfterBreak="0">
     <w:nsid w:val="603A4BE0"/>
     <w:multiLevelType w:val="multilevel"/>
     <w:tmpl w:val="14985332"/>
@@ -3305,7 +4884,7 @@
       </w:rPr>
     </w:lvl>
   </w:abstractNum>
-  <w:abstractNum w:abstractNumId="7" w15:restartNumberingAfterBreak="0">
+  <w:abstractNum w:abstractNumId="8" w15:restartNumberingAfterBreak="0">
     <w:nsid w:val="68223F61"/>
     <w:multiLevelType w:val="multilevel"/>
     <w:tmpl w:val="63BCBD40"/>
@@ -3454,7 +5033,144 @@
       </w:rPr>
     </w:lvl>
   </w:abstractNum>
-  <w:abstractNum w:abstractNumId="8" w15:restartNumberingAfterBreak="0">
+  <w:abstractNum w:abstractNumId="9" w15:restartNumberingAfterBreak="0">
+    <w:nsid w:val="700E26B0"/>
+    <w:multiLevelType w:val="hybridMultilevel"/>
+    <w:tmpl w:val="9D600446"/>
+    <w:lvl w:ilvl="0" w:tplc="040B0001">
+      <w:start w:val="1"/>
+      <w:numFmt w:val="bullet"/>
+      <w:lvlText w:val=""/>
+      <w:lvlJc w:val="left"/>
+      <w:pPr>
+        <w:tabs>
+          <w:tab w:val="num" w:pos="720"/>
+        </w:tabs>
+        <w:ind w:left="720" w:hanging="360"/>
+      </w:pPr>
+      <w:rPr>
+        <w:rFonts w:ascii="Symbol" w:hAnsi="Symbol" w:hint="default"/>
+      </w:rPr>
+    </w:lvl>
+    <w:lvl w:ilvl="1" w:tplc="040B0003">
+      <w:start w:val="1"/>
+      <w:numFmt w:val="bullet"/>
+      <w:lvlText w:val="o"/>
+      <w:lvlJc w:val="left"/>
+      <w:pPr>
+        <w:ind w:left="1440" w:hanging="360"/>
+      </w:pPr>
+      <w:rPr>
+        <w:rFonts w:ascii="Courier New" w:hAnsi="Courier New" w:cs="Courier New" w:hint="default"/>
+      </w:rPr>
+    </w:lvl>
+    <w:lvl w:ilvl="2" w:tplc="0DC81694" w:tentative="1">
+      <w:start w:val="1"/>
+      <w:numFmt w:val="bullet"/>
+      <w:lvlText w:val=""/>
+      <w:lvlJc w:val="left"/>
+      <w:pPr>
+        <w:tabs>
+          <w:tab w:val="num" w:pos="2160"/>
+        </w:tabs>
+        <w:ind w:left="2160" w:hanging="360"/>
+      </w:pPr>
+      <w:rPr>
+        <w:rFonts w:ascii="Symbol" w:hAnsi="Symbol" w:hint="default"/>
+      </w:rPr>
+    </w:lvl>
+    <w:lvl w:ilvl="3" w:tplc="96A6F704" w:tentative="1">
+      <w:start w:val="1"/>
+      <w:numFmt w:val="bullet"/>
+      <w:lvlText w:val=""/>
+      <w:lvlJc w:val="left"/>
+      <w:pPr>
+        <w:tabs>
+          <w:tab w:val="num" w:pos="2880"/>
+        </w:tabs>
+        <w:ind w:left="2880" w:hanging="360"/>
+      </w:pPr>
+      <w:rPr>
+        <w:rFonts w:ascii="Symbol" w:hAnsi="Symbol" w:hint="default"/>
+      </w:rPr>
+    </w:lvl>
+    <w:lvl w:ilvl="4" w:tplc="1FC88466" w:tentative="1">
+      <w:start w:val="1"/>
+      <w:numFmt w:val="bullet"/>
+      <w:lvlText w:val=""/>
+      <w:lvlJc w:val="left"/>
+      <w:pPr>
+        <w:tabs>
+          <w:tab w:val="num" w:pos="3600"/>
+        </w:tabs>
+        <w:ind w:left="3600" w:hanging="360"/>
+      </w:pPr>
+      <w:rPr>
+        <w:rFonts w:ascii="Symbol" w:hAnsi="Symbol" w:hint="default"/>
+      </w:rPr>
+    </w:lvl>
+    <w:lvl w:ilvl="5" w:tplc="C63216DE" w:tentative="1">
+      <w:start w:val="1"/>
+      <w:numFmt w:val="bullet"/>
+      <w:lvlText w:val=""/>
+      <w:lvlJc w:val="left"/>
+      <w:pPr>
+        <w:tabs>
+          <w:tab w:val="num" w:pos="4320"/>
+        </w:tabs>
+        <w:ind w:left="4320" w:hanging="360"/>
+      </w:pPr>
+      <w:rPr>
+        <w:rFonts w:ascii="Symbol" w:hAnsi="Symbol" w:hint="default"/>
+      </w:rPr>
+    </w:lvl>
+    <w:lvl w:ilvl="6" w:tplc="C646F8E2" w:tentative="1">
+      <w:start w:val="1"/>
+      <w:numFmt w:val="bullet"/>
+      <w:lvlText w:val=""/>
+      <w:lvlJc w:val="left"/>
+      <w:pPr>
+        <w:tabs>
+          <w:tab w:val="num" w:pos="5040"/>
+        </w:tabs>
+        <w:ind w:left="5040" w:hanging="360"/>
+      </w:pPr>
+      <w:rPr>
+        <w:rFonts w:ascii="Symbol" w:hAnsi="Symbol" w:hint="default"/>
+      </w:rPr>
+    </w:lvl>
+    <w:lvl w:ilvl="7" w:tplc="C36CA478" w:tentative="1">
+      <w:start w:val="1"/>
+      <w:numFmt w:val="bullet"/>
+      <w:lvlText w:val=""/>
+      <w:lvlJc w:val="left"/>
+      <w:pPr>
+        <w:tabs>
+          <w:tab w:val="num" w:pos="5760"/>
+        </w:tabs>
+        <w:ind w:left="5760" w:hanging="360"/>
+      </w:pPr>
+      <w:rPr>
+        <w:rFonts w:ascii="Symbol" w:hAnsi="Symbol" w:hint="default"/>
+      </w:rPr>
+    </w:lvl>
+    <w:lvl w:ilvl="8" w:tplc="14C08FDA" w:tentative="1">
+      <w:start w:val="1"/>
+      <w:numFmt w:val="bullet"/>
+      <w:lvlText w:val=""/>
+      <w:lvlJc w:val="left"/>
+      <w:pPr>
+        <w:tabs>
+          <w:tab w:val="num" w:pos="6480"/>
+        </w:tabs>
+        <w:ind w:left="6480" w:hanging="360"/>
+      </w:pPr>
+      <w:rPr>
+        <w:rFonts w:ascii="Symbol" w:hAnsi="Symbol" w:hint="default"/>
+      </w:rPr>
+    </w:lvl>
+  </w:abstractNum>
+  <w:abstractNum w:abstractNumId="10" w15:restartNumberingAfterBreak="0">
     <w:nsid w:val="78E54DE4"/>
     <w:multiLevelType w:val="multilevel"/>
     <w:tmpl w:val="C7B85010"/>
@@ -3604,16 +5320,16 @@
     </w:lvl>
   </w:abstractNum>
   <w:num w:numId="1" w16cid:durableId="1969430271">
+    <w:abstractNumId w:val="8"/>
+  </w:num>
+  <w:num w:numId="2" w16cid:durableId="2109421436">
     <w:abstractNumId w:val="7"/>
   </w:num>
-  <w:num w:numId="2" w16cid:durableId="2109421436">
+  <w:num w:numId="3" w16cid:durableId="287663332">
     <w:abstractNumId w:val="6"/>
   </w:num>
-  <w:num w:numId="3" w16cid:durableId="287663332">
-    <w:abstractNumId w:val="5"/>
-  </w:num>
   <w:num w:numId="4" w16cid:durableId="2096585250">
-    <w:abstractNumId w:val="2"/>
+    <w:abstractNumId w:val="3"/>
   </w:num>
   <w:num w:numId="5" w16cid:durableId="893388986">
     <w:abstractNumId w:val="1"/>
@@ -3622,13 +5338,19 @@
     <w:abstractNumId w:val="0"/>
   </w:num>
   <w:num w:numId="7" w16cid:durableId="613833362">
-    <w:abstractNumId w:val="3"/>
+    <w:abstractNumId w:val="4"/>
   </w:num>
   <w:num w:numId="8" w16cid:durableId="727190594">
-    <w:abstractNumId w:val="4"/>
+    <w:abstractNumId w:val="5"/>
   </w:num>
   <w:num w:numId="9" w16cid:durableId="1772118829">
-    <w:abstractNumId w:val="8"/>
+    <w:abstractNumId w:val="10"/>
+  </w:num>
+  <w:num w:numId="10" w16cid:durableId="335882720">
+    <w:abstractNumId w:val="9"/>
+  </w:num>
+  <w:num w:numId="11" w16cid:durableId="518391178">
+    <w:abstractNumId w:val="2"/>
   </w:num>
 </w:numbering>
 </file>
@@ -4236,6 +5958,7 @@
   <w:style w:type="character" w:default="1" w:styleId="Kappaleenoletusfontti">
     <w:name w:val="Default Paragraph Font"/>
     <w:uiPriority w:val="1"/>
+    <w:semiHidden/>
     <w:unhideWhenUsed/>
   </w:style>
   <w:style w:type="table" w:default="1" w:styleId="Normaalitaulukko">

</xml_diff>